<commit_message>
Support multilingual cumulative CS Excel records
</commit_message>
<xml_diff>
--- a/docs/CS-RAG-임원보고서-20260922.docx
+++ b/docs/CS-RAG-임원보고서-20260922.docx
@@ -28,7 +28,7 @@
     </w:p>
     <w:p>
       <w:r>
-        <w:t>여러 사람이 작성한 Excel의 고장·조치 이력을 모아, 문제 현상을 질문하면 관련 과거 사례와 원문 근거를 확인하는 시스템을 구현했습니다. 새 자료를 기존 자료에 계속 추가할 수 있으며, DB 등록이 완료되면 Excel 파일 없이도 검색과 후속 처리를 이어갈 수 있습니다.</w:t>
+        <w:t>여러 사람이 작성한 Excel의 고장·조치 이력을 모아, 문제 현상을 질문하면 관련 과거 사례와 원문 근거를 확인하는 시스템을 구현했습니다. 기존 128열 자료에 누적 28열 자료를 추가하고, 중국어·영어 설명을 한국어로 번역해 검색에 활용하도록 확장했습니다. DB 등록 후에는 Excel 파일 없이도 작업할 수 있습니다.</w:t>
       </w:r>
     </w:p>
     <w:p>
@@ -202,7 +202,7 @@
               <w:rPr>
                 <w:sz w:val="21"/>
               </w:rPr>
-              <w:t>문장을 다듬고 검토 결과를 저장</w:t>
+              <w:t>다국어 번역과 검토 결과 저장</w:t>
             </w:r>
           </w:p>
         </w:tc>
@@ -226,7 +226,7 @@
               <w:rPr>
                 <w:sz w:val="21"/>
               </w:rPr>
-              <w:t>약어와 불규칙한 문장을 읽기 쉽게 정리하고 원문과 비교합니다.</w:t>
+              <w:t>중국어·영어 설명도 한국어로 정리하고 원문과 비교합니다.</w:t>
             </w:r>
           </w:p>
         </w:tc>
@@ -308,7 +308,7 @@
               <w:rPr>
                 <w:sz w:val="21"/>
               </w:rPr>
-              <w:t>답변과 한국어 원문 근거를 함께 제공</w:t>
+              <w:t>한국어 답변과 원문 근거 제공</w:t>
             </w:r>
           </w:p>
         </w:tc>
@@ -475,7 +475,7 @@
     </w:p>
     <w:p>
       <w:r>
-        <w:t>의미 검색은 문장을 의미 비교용 숫자 목록인 ‘벡터’로 바꾸어 비슷한 사례를 찾습니다. 영어 번역은 선택적인 검색·질문 이해 보조 자료이며, 답변의 사실 근거는 항상 한국어 원문입니다. 현재 영어 번역문을 별도로 벡터화하지는 않습니다.</w:t>
+        <w:t>의미 검색은 문장을 의미 비교용 숫자 목록인 ‘벡터’로 바꾸어 비슷한 사례를 찾습니다. 누적 자료는 채택한 한국어 번역도 벡터에 반영합니다. 영어 번역은 선택적인 검색·질문 이해 보조 자료이며, 영어 번역문을 별도로 벡터화하지는 않습니다. 인용 근거는 번역 전 원문입니다.</w:t>
       </w:r>
     </w:p>
     <w:p>
@@ -494,7 +494,7 @@
     </w:p>
     <w:p>
       <w:r>
-        <w:t>새 접수번호는 추가하고, 같은 내용은 기존 다듬기·검토 결과 등을 재사용합니다. 같은 원본 파일에서 내용이 달라진 접수는 해당 건만 갱신하고 이전 검토를 재검토 대상으로 표시합니다. 다른 파일에 같은 접수번호로 다른 내용이 있으면 자동으로 덮어쓰지 않고 등록을 중단합니다.</w:t>
+        <w:t>새 접수번호는 추가하고, 같은 내용은 기존 처리 결과를 재사용합니다. 기존 양식과 누적 양식의 같은 CS 번호는 원문을 각각 보관하고 함께 조회합니다. 접수 건수에서는 한 건으로 셉니다. 같은 파일의 변경분은 갱신하며, 같은 양식의 다른 파일에서 같은 번호가 충돌하면 등록을 중단합니다.</w:t>
       </w:r>
     </w:p>
     <w:p>
@@ -671,7 +671,7 @@
               <w:rPr>
                 <w:sz w:val="21"/>
               </w:rPr>
-              <w:t>37개 PASS 항목을 확인했습니다.</w:t>
+              <w:t>다국어 누적 자료 검사를 포함해 38개 PASS 항목을 확인했습니다.</w:t>
             </w:r>
           </w:p>
         </w:tc>
@@ -695,7 +695,7 @@
               <w:rPr>
                 <w:sz w:val="21"/>
               </w:rPr>
-              <w:t>등록, 검색, 검토, 번역, 벡터, 야간 처리 등의 동작 검사입니다.</w:t>
+              <w:t>모의 응답으로 저장·검색·검토·번역·벡터 동작을 검사했습니다.</w:t>
             </w:r>
           </w:p>
         </w:tc>
@@ -801,7 +801,7 @@
               <w:rPr>
                 <w:sz w:val="21"/>
               </w:rPr>
-              <w:t>자료 보존과 오류 처리</w:t>
+              <w:t>두 양식의 연결과 원문 보존</w:t>
             </w:r>
           </w:p>
         </w:tc>
@@ -825,7 +825,7 @@
               <w:rPr>
                 <w:sz w:val="21"/>
               </w:rPr>
-              <w:t>중복 재사용, 출처 충돌 차단, 저장 실패 시 되돌리기, 변경분 검색 갱신을 확인했습니다.</w:t>
+              <w:t>같은 번호의 두 원문, 번역 채택 후 검색, 중국어 원문 인용을 확인했습니다.</w:t>
             </w:r>
           </w:p>
         </w:tc>
@@ -849,7 +849,7 @@
               <w:rPr>
                 <w:sz w:val="21"/>
               </w:rPr>
-              <w:t>실제 업무 자료의 모든 예외 상황을 검증한 것은 아닙니다.</w:t>
+              <w:t>새 파일의 실제 원문은 아직 제공받지 않았습니다.</w:t>
             </w:r>
           </w:p>
         </w:tc>
@@ -902,7 +902,7 @@
               <w:rPr>
                 <w:sz w:val="21"/>
               </w:rPr>
-              <w:t>68개 파일의 압축을 별도 폴더에 풀어 오프라인 검사와 실행 명령을 확인했습니다.</w:t>
+              <w:t>70개 파일을 별도 폴더에 풀어 오프라인 검사와 실행 명령을 확인했습니다.</w:t>
             </w:r>
           </w:p>
         </w:tc>
@@ -926,7 +926,7 @@
               <w:rPr>
                 <w:sz w:val="21"/>
               </w:rPr>
-              <w:t>Windows용 소스 묶음을 Mac에서 검사했습니다.</w:t>
+              <w:t>Mac에서 검사했으며 Windows 실기기 검증과 구별합니다.</w:t>
             </w:r>
           </w:p>
         </w:tc>
@@ -944,7 +944,7 @@
     </w:p>
     <w:p>
       <w:r>
-        <w:t>현재 검증으로 Windows의 실제 DRM 연동, GPT OSS 120B의 업무 답변 품질, 동시 사용자 수에 따른 처리 성능까지 확인됐다고 볼 수는 없습니다. 자동 숫자·인용 검사는 원문 대비 일부 오류를 차단하지만 문장 의미와 인과관계 전체를 보증하지 않습니다.</w:t>
+        <w:t>LM Studio의 GPT OSS 20B에서 중국어 셀의 한국어 번역을 확인했습니다. 추가 2행 시험은 번역·보정과 벡터 생성을 지났지만 답변이 잘려 전체 흐름은 완료하지 못했습니다. 이는 작은 시험이며 전체 자료의 번역 품질 평가가 아닙니다.</w:t>
       </w:r>
     </w:p>
     <w:p>
@@ -954,6 +954,11 @@
       </w:pPr>
       <w:r>
         <w:t>5 시범 운영에서 확인할 사항</w:t>
+      </w:r>
+    </w:p>
+    <w:p>
+      <w:r>
+        <w:t>현재 검증으로 Windows의 실제 DRM 연동, GPT OSS 120B의 업무 답변 품질, 동시 사용자 수에 따른 처리 성능까지 확인됐다고 볼 수는 없습니다. 자동 숫자·인용 검사는 원문 대비 일부 오류를 차단하지만 문장 의미와 인과관계 전체를 보증하지 않습니다.</w:t>
       </w:r>
     </w:p>
     <w:p>

</xml_diff>

<commit_message>
Queue multiple Excel files with isolated import failures
</commit_message>
<xml_diff>
--- a/docs/CS-RAG-임원보고서-20260922.docx
+++ b/docs/CS-RAG-임원보고서-20260922.docx
@@ -149,7 +149,7 @@
               <w:rPr>
                 <w:sz w:val="21"/>
               </w:rPr>
-              <w:t>Excel 원문을 DB에 누적 등록</w:t>
+              <w:t>여러 Excel을 순차 누적 등록</w:t>
             </w:r>
           </w:p>
         </w:tc>
@@ -173,7 +173,7 @@
               <w:rPr>
                 <w:sz w:val="21"/>
               </w:rPr>
-              <w:t>새 파일을 추가해도 기존 접수 이력을 유지합니다.</w:t>
+              <w:t>파일을 한 번에 대기시키고 오류 파일을 제외해 계속 처리합니다.</w:t>
             </w:r>
           </w:p>
         </w:tc>
@@ -494,7 +494,12 @@
     </w:p>
     <w:p>
       <w:r>
-        <w:t>새 접수번호는 추가하고, 같은 내용은 기존 처리 결과를 재사용합니다. 기존 양식과 누적 양식의 같은 CS 번호는 원문을 각각 보관하고 함께 조회합니다. 접수 건수에서는 한 건으로 셉니다. 같은 파일의 변경분은 갱신하며, 같은 양식의 다른 파일에서 같은 번호가 충돌하면 등록을 중단합니다.</w:t>
+        <w:t>최대 100파일을 한 번에 대기시켜 순서대로 등록합니다. 오류가 생기면 해당 파일 전체를 제외하고 다음 파일을 계속 처리합니다. 앞선 성공분은 보존하며, 문제를 수정한 뒤 실패 파일만 재시도할 수 있습니다. 브라우저를 닫아도 계속되지만 프로그램 재시작 시 대기 목록은 초기화됩니다.</w:t>
+      </w:r>
+    </w:p>
+    <w:p>
+      <w:r>
+        <w:t>새 접수번호는 추가하고, 번호와 원문이 같으면 기존 처리 결과를 재사용합니다. 번호가 다르면 내용이 같아도 별도 사례입니다. 두 양식의 같은 CS 번호는 원문을 각각 보관하고 함께 조회하며 접수 건수에서는 한 건으로 셉니다. 같은 파일의 수정분은 갱신하고, 같은 양식의 다른 파일에서 같은 번호의 내용이 다르면 해당 파일 등록을 중단합니다.</w:t>
       </w:r>
     </w:p>
     <w:p>
@@ -671,7 +676,7 @@
               <w:rPr>
                 <w:sz w:val="21"/>
               </w:rPr>
-              <w:t>다국어 누적 자료 검사를 포함해 38개 PASS 항목을 확인했습니다.</w:t>
+              <w:t>대기열·다국어 자료 검사를 포함해 39개 PASS 항목을 확인했습니다.</w:t>
             </w:r>
           </w:p>
         </w:tc>
@@ -724,7 +729,7 @@
               <w:rPr>
                 <w:sz w:val="21"/>
               </w:rPr>
-              <w:t>원본 파일 삭제 후 처리</w:t>
+              <w:t>파일 대기열과 DB 처리</w:t>
             </w:r>
           </w:p>
         </w:tc>
@@ -748,7 +753,7 @@
               <w:rPr>
                 <w:sz w:val="21"/>
               </w:rPr>
-              <w:t>브라우저에서 등록 후 Excel을 삭제하고 DB 다듬기와 누적 건수 질문을 확인했습니다.</w:t>
+              <w:t>브라우저에서 여러 파일 등록·실패 재시도·새로고침 후 진행 확인을 검사했습니다.</w:t>
             </w:r>
           </w:p>
         </w:tc>
@@ -772,7 +777,7 @@
               <w:rPr>
                 <w:sz w:val="21"/>
               </w:rPr>
-              <w:t>시험용 DB와 모의 AI 응답을 사용했습니다.</w:t>
+              <w:t>시험용 DB를 사용했으며 원본 삭제 후 처리도 앞선 검사에서 확인했습니다.</w:t>
             </w:r>
           </w:p>
         </w:tc>
@@ -902,7 +907,7 @@
               <w:rPr>
                 <w:sz w:val="21"/>
               </w:rPr>
-              <w:t>70개 파일을 별도 폴더에 풀어 오프라인 검사와 실행 명령을 확인했습니다.</w:t>
+              <w:t>71개 파일을 별도 폴더에 풀어 오프라인 검사와 실행 명령을 확인했습니다.</w:t>
             </w:r>
           </w:p>
         </w:tc>
@@ -943,17 +948,17 @@
       </w:r>
     </w:p>
     <w:p>
-      <w:r>
-        <w:t>LM Studio의 GPT OSS 20B에서 중국어 셀의 한국어 번역을 확인했습니다. 추가 2행 시험은 번역·보정과 벡터 생성을 지났지만 답변이 잘려 전체 흐름은 완료하지 못했습니다. 이는 작은 시험이며 전체 자료의 번역 품질 평가가 아닙니다.</w:t>
-      </w:r>
-    </w:p>
-    <w:p>
       <w:pPr>
         <w:pStyle w:val="Heading1"/>
         <w:pageBreakBefore/>
       </w:pPr>
       <w:r>
         <w:t>5 시범 운영에서 확인할 사항</w:t>
+      </w:r>
+    </w:p>
+    <w:p>
+      <w:r>
+        <w:t>LM Studio의 GPT OSS 20B에서 중국어 셀의 한국어 번역을 확인했습니다. 추가 2행 시험은 번역·보정과 벡터 생성을 지났지만 답변이 잘려 전체 흐름은 완료하지 못했습니다. 이는 작은 시험이며 전체 자료의 번역 품질 평가가 아닙니다.</w:t>
       </w:r>
     </w:p>
     <w:p>
@@ -1267,7 +1272,7 @@
     </w:p>
     <w:p>
       <w:r>
-        <w:t>첫째, 실제 Windows PC에서 DRM Excel 등록부터 파일 삭제 후 질문까지 확인해야 합니다. 둘째, 업무 자료로 검색과 답변을 평가하고 틀린 사례를 개선해야 합니다. 셋째, 이용 범위를 넓히기 전에 로그인·권한 관리와 정기 백업·복구 절차를 마련해야 합니다. 현재 UI에는 사용자 인증과 역할별 권한이 없어 신뢰할 수 있는 내부 사용자 범위의 시험 운영이 적합합니다.</w:t>
+        <w:t>실제 Windows에서 DRM 등록부터 원본 삭제 후 질문까지 확인하고, 업무 자료의 검색·답변 오류를 평가해야 합니다. 확대 적용 전에는 로그인·권한 관리와 정기 백업·복구 절차를 마련해야 합니다. 현재 UI에는 사용자 인증·역할별 권한이 없어 신뢰할 수 있는 내부 사용자 범위로 운영합니다.</w:t>
       </w:r>
     </w:p>
     <w:p>
@@ -1285,12 +1290,7 @@
     </w:p>
     <w:p>
       <w:r>
-        <w:t>앞으로 기능 변경 시 코드와 사용 설명, 전체 흐름도, 이 보고서를 함께 갱신하고 관련 검증을 마친 버전을 GitHub에 반영합니다. 배포 파일명에는 한국 시간을 넣어 버전을 구분합니다. 실제 Excel, 운영 DB, API 인증 정보와 요청·응답 로그는 저장소에 올리지 않습니다.</w:t>
-      </w:r>
-    </w:p>
-    <w:p>
-      <w:r>
-        <w:t>임원 보고에서는 구현 사실, 검증 결과, 기대 효과를 구분합니다. 실측 없이 정확도나 비용 절감 수치를 제시하지 않으며, 검증하지 못한 환경과 남은 운영 과제를 함께 기록합니다.</w:t>
+        <w:t>기능 변경 시 코드·사용 설명·흐름도·이 보고서를 함께 갱신하고 검증한 버전을 GitHub에 반영합니다. 배포 파일명은 한국 시간으로 구분합니다. 실제 Excel·운영 DB·인증 정보·요청 로그는 올리지 않습니다. 보고서는 구현 사실과 기대 효과를 구분하며, 미검증 환경을 표시하고 실측하지 않은 정확도·비용 절감 수치를 제시하지 않습니다.</w:t>
       </w:r>
     </w:p>
     <w:p>

</xml_diff>

<commit_message>
Retry overnight preparation until ready and simplify progress UI
</commit_message>
<xml_diff>
--- a/docs/CS-RAG-임원보고서-20260922.docx
+++ b/docs/CS-RAG-임원보고서-20260922.docx
@@ -385,7 +385,7 @@
               <w:rPr>
                 <w:sz w:val="21"/>
               </w:rPr>
-              <w:t>이미 성공한 작업을 재사용하며 검색 준비를 이어갑니다.</w:t>
+              <w:t>성공할 때까지 재시도하며 단계·남은 대기 시간을 표시합니다.</w:t>
             </w:r>
           </w:p>
         </w:tc>
@@ -509,7 +509,7 @@
     </w:p>
     <w:p>
       <w:r>
-        <w:t>야간 실행은 다듬기 결과의 자동 검사를 통과한 미검토 제안을 채택한 뒤 벡터와 영어 검색 자료를 준비합니다. 일시적인 실패는 대기 후 다시 시도하지만, 인증·설정 문제는 확인이 필요합니다. 서버 상태나 반복 실패에 따라 다음 날 아침 완료를 보장할 수는 없습니다.</w:t>
+        <w:t>야간 실행은 검사 통과 제안을 자동 채택하고 벡터·영어 자료를 준비합니다. 모든 단계의 실패를 성공 또는 사용자 중지까지 재시도하며 성공분은 재사용합니다. 화면에서 6단계와 재시도 대기를 확인합니다. 인증·설정 등 외부 원인이 남으면 완료되지 않을 수 있습니다.</w:t>
       </w:r>
     </w:p>
     <w:p>
@@ -729,7 +729,7 @@
               <w:rPr>
                 <w:sz w:val="21"/>
               </w:rPr>
-              <w:t>파일 대기열과 DB 처리</w:t>
+              <w:t>대기열과 야간 실행 화면</w:t>
             </w:r>
           </w:p>
         </w:tc>
@@ -753,7 +753,7 @@
               <w:rPr>
                 <w:sz w:val="21"/>
               </w:rPr>
-              <w:t>브라우저에서 여러 파일 등록·실패 재시도·새로고침 후 진행 확인을 검사했습니다.</w:t>
+              <w:t>여러 파일 등록, 야간 실패 반복·중지·재개·질문 이동을 확인했습니다.</w:t>
             </w:r>
           </w:p>
         </w:tc>

</xml_diff>